<commit_message>
Update V2 output DOCX with fresh demo run
https://claude.ai/code/session_01T4qVPqrrPrq3awLbnXUfob
</commit_message>
<xml_diff>
--- a/output/review_output_v2.docx
+++ b/output/review_output_v2.docx
@@ -54,7 +54,7 @@
       <w:pPr>
         <w:spacing w:after="120"/>
       </w:pPr>
-      <w:del w:id="101" w:author="Agent-2-legal-reviewer" w:date="2026-04-09T03:20:01Z">
+      <w:del w:id="101" w:author="Agent-2-legal-reviewer" w:date="2026-04-09T03:33:44Z">
         <w:r>
           <w:rPr>
             <w:b w:val="0"/>
@@ -63,7 +63,7 @@
           <w:delText xml:space="preserve">This agreement is basically about the consulting services that we're going to provide to the Client.</w:delText>
         </w:r>
       </w:del>
-      <w:ins w:id="102" w:author="Agent-2-legal-reviewer" w:date="2026-04-09T03:20:01Z">
+      <w:ins w:id="102" w:author="Agent-2-legal-reviewer" w:date="2026-04-09T03:33:44Z">
         <w:r>
           <w:rPr>
             <w:b w:val="0"/>
@@ -79,7 +79,7 @@
         </w:rPr>
         <w:t xml:space="preserve"> </w:t>
       </w:r>
-      <w:del w:id="103" w:author="Agent-2-legal-reviewer" w:date="2026-04-09T03:20:01Z">
+      <w:del w:id="103" w:author="Agent-2-legal-reviewer" w:date="2026-04-09T03:33:44Z">
         <w:r>
           <w:rPr>
             <w:b w:val="0"/>
@@ -88,7 +88,7 @@
           <w:delText xml:space="preserve">We'll be helping with legal compliance stuff and regulatory advisory for the Client's business operations in Indonesia.</w:delText>
         </w:r>
       </w:del>
-      <w:ins w:id="104" w:author="Agent-2-legal-reviewer" w:date="2026-04-09T03:20:01Z">
+      <w:ins w:id="104" w:author="Agent-2-legal-reviewer" w:date="2026-04-09T03:33:44Z">
         <w:r>
           <w:rPr>
             <w:b w:val="0"/>
@@ -104,7 +104,7 @@
         </w:rPr>
         <w:t xml:space="preserve"> The scope covers general legal consultation, contract drafting assistance, regulatory filing support, and compliance monitoring. </w:t>
       </w:r>
-      <w:del w:id="105" w:author="Agent-2-legal-reviewer" w:date="2026-04-09T03:20:01Z">
+      <w:del w:id="105" w:author="Agent-2-legal-reviewer" w:date="2026-04-09T03:33:44Z">
         <w:r>
           <w:rPr>
             <w:b w:val="0"/>
@@ -113,7 +113,7 @@
           <w:delText xml:space="preserve">If the Client needs extra services that aren't listed here, we can discuss and add them later with a separate addendum.</w:delText>
         </w:r>
       </w:del>
-      <w:ins w:id="106" w:author="Agent-2-legal-reviewer" w:date="2026-04-09T03:20:01Z">
+      <w:ins w:id="106" w:author="Agent-2-legal-reviewer" w:date="2026-04-09T03:33:44Z">
         <w:r>
           <w:rPr>
             <w:b w:val="0"/>
@@ -127,7 +127,7 @@
       <w:pPr>
         <w:spacing w:after="120"/>
       </w:pPr>
-      <w:del w:id="107" w:author="Agent-2-legal-reviewer" w:date="2026-04-09T03:20:01Z">
+      <w:del w:id="107" w:author="Agent-2-legal-reviewer" w:date="2026-04-09T03:33:44Z">
         <w:r>
           <w:rPr>
             <w:b/>
@@ -136,7 +136,7 @@
           <w:delText xml:space="preserve">2. HOW LONG THIS LASTS</w:delText>
         </w:r>
       </w:del>
-      <w:ins w:id="108" w:author="Agent-2-legal-reviewer" w:date="2026-04-09T03:20:01Z">
+      <w:ins w:id="108" w:author="Agent-2-legal-reviewer" w:date="2026-04-09T03:33:44Z">
         <w:r>
           <w:rPr>
             <w:b/>
@@ -151,7 +151,7 @@
       <w:pPr>
         <w:spacing w:after="120"/>
       </w:pPr>
-      <w:del w:id="109" w:author="Agent-2-legal-reviewer" w:date="2026-04-09T03:20:01Z">
+      <w:del w:id="109" w:author="Agent-2-legal-reviewer" w:date="2026-04-09T03:33:44Z">
         <w:r>
           <w:rPr>
             <w:b w:val="0"/>
@@ -160,7 +160,7 @@
           <w:delText xml:space="preserve">This agreement starts on February 1, 2026 and goes for 12 months until January 31, 2027. If both sides are happy, we can renew it for another year by just agreeing in writing at least 30 days before it ends.</w:delText>
         </w:r>
       </w:del>
-      <w:ins w:id="110" w:author="Agent-2-legal-reviewer" w:date="2026-04-09T03:20:01Z">
+      <w:ins w:id="110" w:author="Agent-2-legal-reviewer" w:date="2026-04-09T03:33:44Z">
         <w:r>
           <w:rPr>
             <w:b w:val="0"/>
@@ -200,7 +200,7 @@
         </w:rPr>
         <w:t xml:space="preserve">The Client will pay us IDR 50,000,000 per month for the services described above. Payment is due within 14 days after we send the invoice at the beginning of each month. </w:t>
       </w:r>
-      <w:del w:id="111" w:author="Agent-2-legal-reviewer" w:date="2026-04-09T03:20:01Z">
+      <w:del w:id="111" w:author="Agent-2-legal-reviewer" w:date="2026-04-09T03:33:44Z">
         <w:r>
           <w:rPr>
             <w:b w:val="0"/>
@@ -209,7 +209,7 @@
           <w:delText xml:space="preserve">If the Client doesn't pay on time, we'll charge a late fee of 1.5% per month on the outstanding amount.</w:delText>
         </w:r>
       </w:del>
-      <w:ins w:id="112" w:author="Agent-2-legal-reviewer" w:date="2026-04-09T03:20:01Z">
+      <w:ins w:id="112" w:author="Agent-2-legal-reviewer" w:date="2026-04-09T03:33:44Z">
         <w:r>
           <w:rPr>
             <w:b w:val="0"/>
@@ -230,7 +230,7 @@
       <w:pPr>
         <w:spacing w:after="120"/>
       </w:pPr>
-      <w:del w:id="113" w:author="Agent-2-legal-reviewer" w:date="2026-04-09T03:20:01Z">
+      <w:del w:id="113" w:author="Agent-2-legal-reviewer" w:date="2026-04-09T03:33:44Z">
         <w:r>
           <w:rPr>
             <w:b/>
@@ -239,7 +239,7 @@
           <w:delText xml:space="preserve">4. WHAT WE PROMISE TO DO</w:delText>
         </w:r>
       </w:del>
-      <w:ins w:id="114" w:author="Agent-2-legal-reviewer" w:date="2026-04-09T03:20:01Z">
+      <w:ins w:id="114" w:author="Agent-2-legal-reviewer" w:date="2026-04-09T03:33:44Z">
         <w:r>
           <w:rPr>
             <w:b/>
@@ -254,7 +254,7 @@
       <w:pPr>
         <w:spacing w:after="120"/>
       </w:pPr>
-      <w:del w:id="115" w:author="Agent-2-legal-reviewer" w:date="2026-04-09T03:20:01Z">
+      <w:del w:id="115" w:author="Agent-2-legal-reviewer" w:date="2026-04-09T03:33:44Z">
         <w:r>
           <w:rPr>
             <w:b w:val="0"/>
@@ -263,7 +263,7 @@
           <w:delText xml:space="preserve">We promise to do our best to provide quality consulting services in line with professional standards.</w:delText>
         </w:r>
       </w:del>
-      <w:ins w:id="116" w:author="Agent-2-legal-reviewer" w:date="2026-04-09T03:20:01Z">
+      <w:ins w:id="116" w:author="Agent-2-legal-reviewer" w:date="2026-04-09T03:33:44Z">
         <w:r>
           <w:rPr>
             <w:b w:val="0"/>
@@ -279,7 +279,7 @@
         </w:rPr>
         <w:t xml:space="preserve"> Our team will assign at least one senior consultant to handle the Client's account. We will respond to the Client's inquiries within 2 business days under normal circumstances. </w:t>
       </w:r>
-      <w:del w:id="117" w:author="Agent-2-legal-reviewer" w:date="2026-04-09T03:20:01Z">
+      <w:del w:id="117" w:author="Agent-2-legal-reviewer" w:date="2026-04-09T03:33:44Z">
         <w:r>
           <w:rPr>
             <w:b w:val="0"/>
@@ -288,7 +288,7 @@
           <w:delText xml:space="preserve">For urgent matters that affect the Client's legal standing, we will try to respond within 24 hours.</w:delText>
         </w:r>
       </w:del>
-      <w:ins w:id="118" w:author="Agent-2-legal-reviewer" w:date="2026-04-09T03:20:01Z">
+      <w:ins w:id="118" w:author="Agent-2-legal-reviewer" w:date="2026-04-09T03:33:44Z">
         <w:r>
           <w:rPr>
             <w:b w:val="0"/>
@@ -304,7 +304,7 @@
         </w:rPr>
         <w:t xml:space="preserve"> </w:t>
       </w:r>
-      <w:del w:id="119" w:author="Agent-2-legal-reviewer" w:date="2026-04-09T03:20:01Z">
+      <w:del w:id="119" w:author="Agent-2-legal-reviewer" w:date="2026-04-09T03:33:44Z">
         <w:r>
           <w:rPr>
             <w:b w:val="0"/>
@@ -313,7 +313,7 @@
           <w:delText xml:space="preserve">We'll provide monthly summary reports of all activities and advice given during that period.</w:delText>
         </w:r>
       </w:del>
-      <w:ins w:id="120" w:author="Agent-2-legal-reviewer" w:date="2026-04-09T03:20:01Z">
+      <w:ins w:id="120" w:author="Agent-2-legal-reviewer" w:date="2026-04-09T03:33:44Z">
         <w:r>
           <w:rPr>
             <w:b w:val="0"/>
@@ -356,7 +356,7 @@
       <w:pPr>
         <w:spacing w:after="120"/>
       </w:pPr>
-      <w:del w:id="121" w:author="Agent-2-legal-reviewer" w:date="2026-04-09T03:20:01Z">
+      <w:del w:id="121" w:author="Agent-2-legal-reviewer" w:date="2026-04-09T03:33:44Z">
         <w:r>
           <w:rPr>
             <w:b/>
@@ -365,7 +365,7 @@
           <w:delText xml:space="preserve">6. WHO OWNS THE WORK</w:delText>
         </w:r>
       </w:del>
-      <w:ins w:id="122" w:author="Agent-2-legal-reviewer" w:date="2026-04-09T03:20:01Z">
+      <w:ins w:id="122" w:author="Agent-2-legal-reviewer" w:date="2026-04-09T03:33:44Z">
         <w:r>
           <w:rPr>
             <w:b/>
@@ -404,7 +404,7 @@
       <w:pPr>
         <w:spacing w:after="120"/>
       </w:pPr>
-      <w:del w:id="123" w:author="Agent-2-legal-reviewer" w:date="2026-04-09T03:20:01Z">
+      <w:del w:id="123" w:author="Agent-2-legal-reviewer" w:date="2026-04-09T03:33:44Z">
         <w:r>
           <w:rPr>
             <w:b w:val="0"/>
@@ -413,7 +413,7 @@
           <w:delText xml:space="preserve">Our total liability under this agreement won't exceed the total fees paid by the Client in the last 6 months.</w:delText>
         </w:r>
       </w:del>
-      <w:ins w:id="124" w:author="Agent-2-legal-reviewer" w:date="2026-04-09T03:20:01Z">
+      <w:ins w:id="124" w:author="Agent-2-legal-reviewer" w:date="2026-04-09T03:33:44Z">
         <w:r>
           <w:rPr>
             <w:b w:val="0"/>
@@ -429,7 +429,7 @@
         </w:rPr>
         <w:t xml:space="preserve"> </w:t>
       </w:r>
-      <w:del w:id="125" w:author="Agent-2-legal-reviewer" w:date="2026-04-09T03:20:01Z">
+      <w:del w:id="125" w:author="Agent-2-legal-reviewer" w:date="2026-04-09T03:33:44Z">
         <w:r>
           <w:rPr>
             <w:b w:val="0"/>
@@ -438,7 +438,7 @@
           <w:delText xml:space="preserve">We're not responsible for any indirect damages, lost profits, or consequential losses even if we were told they might happen.</w:delText>
         </w:r>
       </w:del>
-      <w:ins w:id="126" w:author="Agent-2-legal-reviewer" w:date="2026-04-09T03:20:01Z">
+      <w:ins w:id="126" w:author="Agent-2-legal-reviewer" w:date="2026-04-09T03:33:44Z">
         <w:r>
           <w:rPr>
             <w:b w:val="0"/>
@@ -471,7 +471,7 @@
       <w:pPr>
         <w:spacing w:after="120"/>
       </w:pPr>
-      <w:del w:id="127" w:author="Agent-2-legal-reviewer" w:date="2026-04-09T03:20:01Z">
+      <w:del w:id="127" w:author="Agent-2-legal-reviewer" w:date="2026-04-09T03:33:44Z">
         <w:r>
           <w:rPr>
             <w:b w:val="0"/>
@@ -480,7 +480,7 @@
           <w:delText xml:space="preserve">If there's a disagreement between us, we'll first try to sort it out through friendly discussion within 30 days.</w:delText>
         </w:r>
       </w:del>
-      <w:ins w:id="128" w:author="Agent-2-legal-reviewer" w:date="2026-04-09T03:20:01Z">
+      <w:ins w:id="128" w:author="Agent-2-legal-reviewer" w:date="2026-04-09T03:33:44Z">
         <w:r>
           <w:rPr>
             <w:b w:val="0"/>
@@ -496,7 +496,7 @@
         </w:rPr>
         <w:t xml:space="preserve"> </w:t>
       </w:r>
-      <w:del w:id="129" w:author="Agent-2-legal-reviewer" w:date="2026-04-09T03:20:01Z">
+      <w:del w:id="129" w:author="Agent-2-legal-reviewer" w:date="2026-04-09T03:33:44Z">
         <w:r>
           <w:rPr>
             <w:b w:val="0"/>
@@ -505,7 +505,7 @@
           <w:delText xml:space="preserve">If that doesn't work, we agree to go to mediation using a mediator that both sides can agree on.</w:delText>
         </w:r>
       </w:del>
-      <w:ins w:id="130" w:author="Agent-2-legal-reviewer" w:date="2026-04-09T03:20:01Z">
+      <w:ins w:id="130" w:author="Agent-2-legal-reviewer" w:date="2026-04-09T03:33:44Z">
         <w:r>
           <w:rPr>
             <w:b w:val="0"/>
@@ -526,7 +526,7 @@
       <w:pPr>
         <w:spacing w:after="120"/>
       </w:pPr>
-      <w:del w:id="131" w:author="Agent-2-legal-reviewer" w:date="2026-04-09T03:20:01Z">
+      <w:del w:id="131" w:author="Agent-2-legal-reviewer" w:date="2026-04-09T03:33:44Z">
         <w:r>
           <w:rPr>
             <w:b/>
@@ -535,7 +535,7 @@
           <w:delText xml:space="preserve">9. GENERAL STUFF</w:delText>
         </w:r>
       </w:del>
-      <w:ins w:id="132" w:author="Agent-2-legal-reviewer" w:date="2026-04-09T03:20:01Z">
+      <w:ins w:id="132" w:author="Agent-2-legal-reviewer" w:date="2026-04-09T03:33:44Z">
         <w:r>
           <w:rPr>
             <w:b/>

</xml_diff>

<commit_message>
Fix mock metadata leaking into tracked changes
Problem: mock regex-parsed prompt formatting text ("Sentences in
Document A: [0]") and inserted it as revision text in the DOCX.

Fixes:
- Mock now uses cached paragraph data directly instead of regex-parsing
  the agent message — eliminates source of contamination
- validation.py: added metadata detection guard (_METADATA_PATTERNS)
  that catches prompt artifacts in revised text and auto-fixes them
  to KEEP (defense in depth for real API responses too)

Result: 7 clean surgical changes, zero metadata contamination

https://claude.ai/code/session_01T4qVPqrrPrq3awLbnXUfob
</commit_message>
<xml_diff>
--- a/output/review_output_v2.docx
+++ b/output/review_output_v2.docx
@@ -54,7 +54,7 @@
       <w:pPr>
         <w:spacing w:after="120"/>
       </w:pPr>
-      <w:del w:id="101" w:author="Agent-2-legal-reviewer" w:date="2026-04-09T03:33:44Z">
+      <w:del w:id="101" w:author="Agent-2-legal-reviewer" w:date="2026-04-09T03:49:13Z">
         <w:r>
           <w:rPr>
             <w:b w:val="0"/>
@@ -63,7 +63,7 @@
           <w:delText xml:space="preserve">This agreement is basically about the consulting services that we're going to provide to the Client.</w:delText>
         </w:r>
       </w:del>
-      <w:ins w:id="102" w:author="Agent-2-legal-reviewer" w:date="2026-04-09T03:33:44Z">
+      <w:ins w:id="102" w:author="Agent-2-legal-reviewer" w:date="2026-04-09T03:49:13Z">
         <w:r>
           <w:rPr>
             <w:b w:val="0"/>
@@ -79,7 +79,7 @@
         </w:rPr>
         <w:t xml:space="preserve"> </w:t>
       </w:r>
-      <w:del w:id="103" w:author="Agent-2-legal-reviewer" w:date="2026-04-09T03:33:44Z">
+      <w:del w:id="103" w:author="Agent-2-legal-reviewer" w:date="2026-04-09T03:49:13Z">
         <w:r>
           <w:rPr>
             <w:b w:val="0"/>
@@ -88,7 +88,7 @@
           <w:delText xml:space="preserve">We'll be helping with legal compliance stuff and regulatory advisory for the Client's business operations in Indonesia.</w:delText>
         </w:r>
       </w:del>
-      <w:ins w:id="104" w:author="Agent-2-legal-reviewer" w:date="2026-04-09T03:33:44Z">
+      <w:ins w:id="104" w:author="Agent-2-legal-reviewer" w:date="2026-04-09T03:49:13Z">
         <w:r>
           <w:rPr>
             <w:b w:val="0"/>
@@ -104,7 +104,7 @@
         </w:rPr>
         <w:t xml:space="preserve"> The scope covers general legal consultation, contract drafting assistance, regulatory filing support, and compliance monitoring. </w:t>
       </w:r>
-      <w:del w:id="105" w:author="Agent-2-legal-reviewer" w:date="2026-04-09T03:33:44Z">
+      <w:del w:id="105" w:author="Agent-2-legal-reviewer" w:date="2026-04-09T03:49:13Z">
         <w:r>
           <w:rPr>
             <w:b w:val="0"/>
@@ -113,7 +113,7 @@
           <w:delText xml:space="preserve">If the Client needs extra services that aren't listed here, we can discuss and add them later with a separate addendum.</w:delText>
         </w:r>
       </w:del>
-      <w:ins w:id="106" w:author="Agent-2-legal-reviewer" w:date="2026-04-09T03:33:44Z">
+      <w:ins w:id="106" w:author="Agent-2-legal-reviewer" w:date="2026-04-09T03:49:13Z">
         <w:r>
           <w:rPr>
             <w:b w:val="0"/>
@@ -127,31 +127,19 @@
       <w:pPr>
         <w:spacing w:after="120"/>
       </w:pPr>
-      <w:del w:id="107" w:author="Agent-2-legal-reviewer" w:date="2026-04-09T03:33:44Z">
-        <w:r>
-          <w:rPr>
-            <w:b/>
-            <w:sz w:val="22"/>
-          </w:rPr>
-          <w:delText xml:space="preserve">2. HOW LONG THIS LASTS</w:delText>
-        </w:r>
-      </w:del>
-      <w:ins w:id="108" w:author="Agent-2-legal-reviewer" w:date="2026-04-09T03:33:44Z">
-        <w:r>
-          <w:rPr>
-            <w:b/>
-            <w:sz w:val="22"/>
-          </w:rPr>
-          <w:t xml:space="preserve">Sentences in Document A:
-  [0]</w:t>
-        </w:r>
-      </w:ins>
+      <w:r>
+        <w:rPr>
+          <w:b/>
+          <w:sz w:val="22"/>
+        </w:rPr>
+        <w:t>2. HOW LONG THIS LASTS</w:t>
+      </w:r>
     </w:p>
     <w:p>
       <w:pPr>
         <w:spacing w:after="120"/>
       </w:pPr>
-      <w:del w:id="109" w:author="Agent-2-legal-reviewer" w:date="2026-04-09T03:33:44Z">
+      <w:del w:id="107" w:author="Agent-2-legal-reviewer" w:date="2026-04-09T03:49:13Z">
         <w:r>
           <w:rPr>
             <w:b w:val="0"/>
@@ -160,7 +148,7 @@
           <w:delText xml:space="preserve">This agreement starts on February 1, 2026 and goes for 12 months until January 31, 2027. If both sides are happy, we can renew it for another year by just agreeing in writing at least 30 days before it ends.</w:delText>
         </w:r>
       </w:del>
-      <w:ins w:id="110" w:author="Agent-2-legal-reviewer" w:date="2026-04-09T03:33:44Z">
+      <w:ins w:id="108" w:author="Agent-2-legal-reviewer" w:date="2026-04-09T03:49:13Z">
         <w:r>
           <w:rPr>
             <w:b w:val="0"/>
@@ -200,7 +188,7 @@
         </w:rPr>
         <w:t xml:space="preserve">The Client will pay us IDR 50,000,000 per month for the services described above. Payment is due within 14 days after we send the invoice at the beginning of each month. </w:t>
       </w:r>
-      <w:del w:id="111" w:author="Agent-2-legal-reviewer" w:date="2026-04-09T03:33:44Z">
+      <w:del w:id="109" w:author="Agent-2-legal-reviewer" w:date="2026-04-09T03:49:13Z">
         <w:r>
           <w:rPr>
             <w:b w:val="0"/>
@@ -209,7 +197,7 @@
           <w:delText xml:space="preserve">If the Client doesn't pay on time, we'll charge a late fee of 1.5% per month on the outstanding amount.</w:delText>
         </w:r>
       </w:del>
-      <w:ins w:id="112" w:author="Agent-2-legal-reviewer" w:date="2026-04-09T03:33:44Z">
+      <w:ins w:id="110" w:author="Agent-2-legal-reviewer" w:date="2026-04-09T03:49:13Z">
         <w:r>
           <w:rPr>
             <w:b w:val="0"/>
@@ -230,31 +218,19 @@
       <w:pPr>
         <w:spacing w:after="120"/>
       </w:pPr>
-      <w:del w:id="113" w:author="Agent-2-legal-reviewer" w:date="2026-04-09T03:33:44Z">
-        <w:r>
-          <w:rPr>
-            <w:b/>
-            <w:sz w:val="22"/>
-          </w:rPr>
-          <w:delText xml:space="preserve">4. WHAT WE PROMISE TO DO</w:delText>
-        </w:r>
-      </w:del>
-      <w:ins w:id="114" w:author="Agent-2-legal-reviewer" w:date="2026-04-09T03:33:44Z">
-        <w:r>
-          <w:rPr>
-            <w:b/>
-            <w:sz w:val="22"/>
-          </w:rPr>
-          <w:t xml:space="preserve">Sentences in Document A:
-  [0]</w:t>
-        </w:r>
-      </w:ins>
+      <w:r>
+        <w:rPr>
+          <w:b/>
+          <w:sz w:val="22"/>
+        </w:rPr>
+        <w:t>4. WHAT WE PROMISE TO DO</w:t>
+      </w:r>
     </w:p>
     <w:p>
       <w:pPr>
         <w:spacing w:after="120"/>
       </w:pPr>
-      <w:del w:id="115" w:author="Agent-2-legal-reviewer" w:date="2026-04-09T03:33:44Z">
+      <w:del w:id="111" w:author="Agent-2-legal-reviewer" w:date="2026-04-09T03:49:13Z">
         <w:r>
           <w:rPr>
             <w:b w:val="0"/>
@@ -263,7 +239,7 @@
           <w:delText xml:space="preserve">We promise to do our best to provide quality consulting services in line with professional standards.</w:delText>
         </w:r>
       </w:del>
-      <w:ins w:id="116" w:author="Agent-2-legal-reviewer" w:date="2026-04-09T03:33:44Z">
+      <w:ins w:id="112" w:author="Agent-2-legal-reviewer" w:date="2026-04-09T03:49:13Z">
         <w:r>
           <w:rPr>
             <w:b w:val="0"/>
@@ -279,7 +255,7 @@
         </w:rPr>
         <w:t xml:space="preserve"> Our team will assign at least one senior consultant to handle the Client's account. We will respond to the Client's inquiries within 2 business days under normal circumstances. </w:t>
       </w:r>
-      <w:del w:id="117" w:author="Agent-2-legal-reviewer" w:date="2026-04-09T03:33:44Z">
+      <w:del w:id="113" w:author="Agent-2-legal-reviewer" w:date="2026-04-09T03:49:13Z">
         <w:r>
           <w:rPr>
             <w:b w:val="0"/>
@@ -288,7 +264,7 @@
           <w:delText xml:space="preserve">For urgent matters that affect the Client's legal standing, we will try to respond within 24 hours.</w:delText>
         </w:r>
       </w:del>
-      <w:ins w:id="118" w:author="Agent-2-legal-reviewer" w:date="2026-04-09T03:33:44Z">
+      <w:ins w:id="114" w:author="Agent-2-legal-reviewer" w:date="2026-04-09T03:49:13Z">
         <w:r>
           <w:rPr>
             <w:b w:val="0"/>
@@ -304,7 +280,7 @@
         </w:rPr>
         <w:t xml:space="preserve"> </w:t>
       </w:r>
-      <w:del w:id="119" w:author="Agent-2-legal-reviewer" w:date="2026-04-09T03:33:44Z">
+      <w:del w:id="115" w:author="Agent-2-legal-reviewer" w:date="2026-04-09T03:49:13Z">
         <w:r>
           <w:rPr>
             <w:b w:val="0"/>
@@ -313,7 +289,7 @@
           <w:delText xml:space="preserve">We'll provide monthly summary reports of all activities and advice given during that period.</w:delText>
         </w:r>
       </w:del>
-      <w:ins w:id="120" w:author="Agent-2-legal-reviewer" w:date="2026-04-09T03:33:44Z">
+      <w:ins w:id="116" w:author="Agent-2-legal-reviewer" w:date="2026-04-09T03:49:13Z">
         <w:r>
           <w:rPr>
             <w:b w:val="0"/>
@@ -356,25 +332,13 @@
       <w:pPr>
         <w:spacing w:after="120"/>
       </w:pPr>
-      <w:del w:id="121" w:author="Agent-2-legal-reviewer" w:date="2026-04-09T03:33:44Z">
-        <w:r>
-          <w:rPr>
-            <w:b/>
-            <w:sz w:val="22"/>
-          </w:rPr>
-          <w:delText xml:space="preserve">6. WHO OWNS THE WORK</w:delText>
-        </w:r>
-      </w:del>
-      <w:ins w:id="122" w:author="Agent-2-legal-reviewer" w:date="2026-04-09T03:33:44Z">
-        <w:r>
-          <w:rPr>
-            <w:b/>
-            <w:sz w:val="22"/>
-          </w:rPr>
-          <w:t xml:space="preserve">Sentences in Document A:
-  [0] 6. WHO OWNS THE WORK</w:t>
-        </w:r>
-      </w:ins>
+      <w:r>
+        <w:rPr>
+          <w:b/>
+          <w:sz w:val="22"/>
+        </w:rPr>
+        <w:t>6. WHO OWNS THE WORK</w:t>
+      </w:r>
     </w:p>
     <w:p>
       <w:pPr>
@@ -404,7 +368,7 @@
       <w:pPr>
         <w:spacing w:after="120"/>
       </w:pPr>
-      <w:del w:id="123" w:author="Agent-2-legal-reviewer" w:date="2026-04-09T03:33:44Z">
+      <w:del w:id="117" w:author="Agent-2-legal-reviewer" w:date="2026-04-09T03:49:13Z">
         <w:r>
           <w:rPr>
             <w:b w:val="0"/>
@@ -413,7 +377,7 @@
           <w:delText xml:space="preserve">Our total liability under this agreement won't exceed the total fees paid by the Client in the last 6 months.</w:delText>
         </w:r>
       </w:del>
-      <w:ins w:id="124" w:author="Agent-2-legal-reviewer" w:date="2026-04-09T03:33:44Z">
+      <w:ins w:id="118" w:author="Agent-2-legal-reviewer" w:date="2026-04-09T03:49:13Z">
         <w:r>
           <w:rPr>
             <w:b w:val="0"/>
@@ -429,7 +393,7 @@
         </w:rPr>
         <w:t xml:space="preserve"> </w:t>
       </w:r>
-      <w:del w:id="125" w:author="Agent-2-legal-reviewer" w:date="2026-04-09T03:33:44Z">
+      <w:del w:id="119" w:author="Agent-2-legal-reviewer" w:date="2026-04-09T03:49:13Z">
         <w:r>
           <w:rPr>
             <w:b w:val="0"/>
@@ -438,7 +402,7 @@
           <w:delText xml:space="preserve">We're not responsible for any indirect damages, lost profits, or consequential losses even if we were told they might happen.</w:delText>
         </w:r>
       </w:del>
-      <w:ins w:id="126" w:author="Agent-2-legal-reviewer" w:date="2026-04-09T03:33:44Z">
+      <w:ins w:id="120" w:author="Agent-2-legal-reviewer" w:date="2026-04-09T03:49:13Z">
         <w:r>
           <w:rPr>
             <w:b w:val="0"/>
@@ -471,7 +435,7 @@
       <w:pPr>
         <w:spacing w:after="120"/>
       </w:pPr>
-      <w:del w:id="127" w:author="Agent-2-legal-reviewer" w:date="2026-04-09T03:33:44Z">
+      <w:del w:id="121" w:author="Agent-2-legal-reviewer" w:date="2026-04-09T03:49:13Z">
         <w:r>
           <w:rPr>
             <w:b w:val="0"/>
@@ -480,7 +444,7 @@
           <w:delText xml:space="preserve">If there's a disagreement between us, we'll first try to sort it out through friendly discussion within 30 days.</w:delText>
         </w:r>
       </w:del>
-      <w:ins w:id="128" w:author="Agent-2-legal-reviewer" w:date="2026-04-09T03:33:44Z">
+      <w:ins w:id="122" w:author="Agent-2-legal-reviewer" w:date="2026-04-09T03:49:13Z">
         <w:r>
           <w:rPr>
             <w:b w:val="0"/>
@@ -496,7 +460,7 @@
         </w:rPr>
         <w:t xml:space="preserve"> </w:t>
       </w:r>
-      <w:del w:id="129" w:author="Agent-2-legal-reviewer" w:date="2026-04-09T03:33:44Z">
+      <w:del w:id="123" w:author="Agent-2-legal-reviewer" w:date="2026-04-09T03:49:13Z">
         <w:r>
           <w:rPr>
             <w:b w:val="0"/>
@@ -505,7 +469,7 @@
           <w:delText xml:space="preserve">If that doesn't work, we agree to go to mediation using a mediator that both sides can agree on.</w:delText>
         </w:r>
       </w:del>
-      <w:ins w:id="130" w:author="Agent-2-legal-reviewer" w:date="2026-04-09T03:33:44Z">
+      <w:ins w:id="124" w:author="Agent-2-legal-reviewer" w:date="2026-04-09T03:49:13Z">
         <w:r>
           <w:rPr>
             <w:b w:val="0"/>
@@ -526,7 +490,7 @@
       <w:pPr>
         <w:spacing w:after="120"/>
       </w:pPr>
-      <w:del w:id="131" w:author="Agent-2-legal-reviewer" w:date="2026-04-09T03:33:44Z">
+      <w:del w:id="125" w:author="Agent-2-legal-reviewer" w:date="2026-04-09T03:49:13Z">
         <w:r>
           <w:rPr>
             <w:b/>
@@ -535,7 +499,7 @@
           <w:delText xml:space="preserve">9. GENERAL STUFF</w:delText>
         </w:r>
       </w:del>
-      <w:ins w:id="132" w:author="Agent-2-legal-reviewer" w:date="2026-04-09T03:33:44Z">
+      <w:ins w:id="126" w:author="Agent-2-legal-reviewer" w:date="2026-04-09T03:49:13Z">
         <w:r>
           <w:rPr>
             <w:b/>

</xml_diff>